<commit_message>
tests: add tests for page breaks
</commit_message>
<xml_diff>
--- a/tests/output_reference.docx
+++ b/tests/output_reference.docx
@@ -1183,6 +1183,11 @@
       </w:r>
     </w:p>
     <w:p>
+      <w:r>
+        <w:br w:type="page"/>
+      </w:r>
+    </w:p>
+    <w:p>
       <w:pPr>
         <w:pStyle w:val="BodyText"/>
       </w:pPr>
@@ -1202,6 +1207,11 @@
           <w:rStyle w:val="Color0047B2"/>
         </w:rPr>
         <w:t xml:space="preserve">twenty seven</w:t>
+      </w:r>
+    </w:p>
+    <w:p>
+      <w:r>
+        <w:br w:type="page"/>
       </w:r>
     </w:p>
     <w:p>

</xml_diff>